<commit_message>
Update lab report: add screenshots
</commit_message>
<xml_diff>
--- a/Lab2.docx
+++ b/Lab2.docx
@@ -176,6 +176,7 @@
       <w:r>
         <w:rPr>
           <w:rFonts w:ascii="Times New Roman" w:hAnsi="Times New Roman" w:cs="Times New Roman"/>
+          <w:noProof/>
           <w:sz w:val="28"/>
           <w:szCs w:val="28"/>
         </w:rPr>
@@ -271,6 +272,7 @@
       <w:r>
         <w:rPr>
           <w:rFonts w:ascii="Times New Roman" w:hAnsi="Times New Roman" w:cs="Times New Roman"/>
+          <w:noProof/>
           <w:sz w:val="28"/>
           <w:szCs w:val="28"/>
         </w:rPr>
@@ -329,25 +331,7 @@
           <w:szCs w:val="28"/>
           <w:lang w:val="ru-BY"/>
         </w:rPr>
-        <w:t>Рисунок</w:t>
-      </w:r>
-      <w:r>
-        <w:rPr>
-          <w:rFonts w:ascii="Times New Roman" w:hAnsi="Times New Roman" w:cs="Times New Roman"/>
-          <w:sz w:val="28"/>
-          <w:szCs w:val="28"/>
-          <w:lang w:val="ru-BY"/>
-        </w:rPr>
-        <w:t xml:space="preserve"> 2</w:t>
-      </w:r>
-      <w:r>
-        <w:rPr>
-          <w:rFonts w:ascii="Times New Roman" w:hAnsi="Times New Roman" w:cs="Times New Roman"/>
-          <w:sz w:val="28"/>
-          <w:szCs w:val="28"/>
-          <w:lang w:val="ru-BY"/>
-        </w:rPr>
-        <w:t xml:space="preserve"> – </w:t>
+        <w:t xml:space="preserve">Рисунок 2 – </w:t>
       </w:r>
       <w:r>
         <w:rPr>
@@ -385,9 +369,9 @@
       <w:r>
         <w:rPr>
           <w:rFonts w:ascii="Times New Roman" w:hAnsi="Times New Roman" w:cs="Times New Roman"/>
-          <w:sz w:val="28"/>
-          <w:szCs w:val="28"/>
-          <w:lang w:val="ru-BY"/>
+          <w:noProof/>
+          <w:sz w:val="28"/>
+          <w:szCs w:val="28"/>
         </w:rPr>
         <w:lastRenderedPageBreak/>
         <w:drawing>
@@ -445,25 +429,7 @@
           <w:szCs w:val="28"/>
           <w:lang w:val="ru-BY"/>
         </w:rPr>
-        <w:t>Рисунок</w:t>
-      </w:r>
-      <w:r>
-        <w:rPr>
-          <w:rFonts w:ascii="Times New Roman" w:hAnsi="Times New Roman" w:cs="Times New Roman"/>
-          <w:sz w:val="28"/>
-          <w:szCs w:val="28"/>
-          <w:lang w:val="ru-BY"/>
-        </w:rPr>
-        <w:t xml:space="preserve"> 3</w:t>
-      </w:r>
-      <w:r>
-        <w:rPr>
-          <w:rFonts w:ascii="Times New Roman" w:hAnsi="Times New Roman" w:cs="Times New Roman"/>
-          <w:sz w:val="28"/>
-          <w:szCs w:val="28"/>
-          <w:lang w:val="ru-BY"/>
-        </w:rPr>
-        <w:t xml:space="preserve"> – </w:t>
+        <w:t xml:space="preserve">Рисунок 3 – </w:t>
       </w:r>
       <w:r>
         <w:rPr>
@@ -552,6 +518,7 @@
       <w:r>
         <w:rPr>
           <w:rFonts w:ascii="Times New Roman" w:hAnsi="Times New Roman" w:cs="Times New Roman"/>
+          <w:noProof/>
           <w:sz w:val="28"/>
           <w:szCs w:val="28"/>
         </w:rPr>
@@ -610,25 +577,7 @@
           <w:szCs w:val="28"/>
           <w:lang w:val="ru-BY"/>
         </w:rPr>
-        <w:t>Рисунок</w:t>
-      </w:r>
-      <w:r>
-        <w:rPr>
-          <w:rFonts w:ascii="Times New Roman" w:hAnsi="Times New Roman" w:cs="Times New Roman"/>
-          <w:sz w:val="28"/>
-          <w:szCs w:val="28"/>
-          <w:lang w:val="ru-BY"/>
-        </w:rPr>
-        <w:t xml:space="preserve"> 4</w:t>
-      </w:r>
-      <w:r>
-        <w:rPr>
-          <w:rFonts w:ascii="Times New Roman" w:hAnsi="Times New Roman" w:cs="Times New Roman"/>
-          <w:sz w:val="28"/>
-          <w:szCs w:val="28"/>
-          <w:lang w:val="ru-BY"/>
-        </w:rPr>
-        <w:t xml:space="preserve"> – </w:t>
+        <w:t xml:space="preserve">Рисунок 4 – </w:t>
       </w:r>
       <w:r>
         <w:rPr>
@@ -694,6 +643,7 @@
       <w:r>
         <w:rPr>
           <w:rFonts w:ascii="Times New Roman" w:hAnsi="Times New Roman" w:cs="Times New Roman"/>
+          <w:noProof/>
           <w:sz w:val="28"/>
           <w:szCs w:val="28"/>
         </w:rPr>
@@ -750,14 +700,41 @@
           <w:szCs w:val="28"/>
           <w:lang w:val="ru-BY"/>
         </w:rPr>
-        <w:t>Рисунок</w:t>
-      </w:r>
-      <w:r>
-        <w:rPr>
-          <w:rFonts w:ascii="Times New Roman" w:hAnsi="Times New Roman" w:cs="Times New Roman"/>
-          <w:sz w:val="28"/>
-          <w:szCs w:val="28"/>
-          <w:lang w:val="ru-BY"/>
+        <w:t xml:space="preserve">Рисунок </w:t>
+      </w:r>
+      <w:r>
+        <w:rPr>
+          <w:rFonts w:ascii="Times New Roman" w:hAnsi="Times New Roman" w:cs="Times New Roman"/>
+          <w:sz w:val="28"/>
+          <w:szCs w:val="28"/>
+          <w:lang w:val="ru-RU"/>
+        </w:rPr>
+        <w:t>5</w:t>
+      </w:r>
+      <w:r>
+        <w:rPr>
+          <w:rFonts w:ascii="Times New Roman" w:hAnsi="Times New Roman" w:cs="Times New Roman"/>
+          <w:sz w:val="28"/>
+          <w:szCs w:val="28"/>
+          <w:lang w:val="ru-BY"/>
+        </w:rPr>
+        <w:t xml:space="preserve"> – </w:t>
+      </w:r>
+      <w:r>
+        <w:rPr>
+          <w:rFonts w:ascii="Times New Roman" w:hAnsi="Times New Roman" w:cs="Times New Roman"/>
+          <w:sz w:val="28"/>
+          <w:szCs w:val="28"/>
+          <w:lang w:val="ru-BY"/>
+        </w:rPr>
+        <w:t>Коммит файла</w:t>
+      </w:r>
+      <w:r>
+        <w:rPr>
+          <w:rFonts w:ascii="Times New Roman" w:hAnsi="Times New Roman" w:cs="Times New Roman"/>
+          <w:sz w:val="28"/>
+          <w:szCs w:val="28"/>
+          <w:lang w:val="ru-RU"/>
         </w:rPr>
         <w:t xml:space="preserve"> </w:t>
       </w:r>
@@ -766,42 +743,6 @@
           <w:rFonts w:ascii="Times New Roman" w:hAnsi="Times New Roman" w:cs="Times New Roman"/>
           <w:sz w:val="28"/>
           <w:szCs w:val="28"/>
-          <w:lang w:val="ru-RU"/>
-        </w:rPr>
-        <w:t>5</w:t>
-      </w:r>
-      <w:r>
-        <w:rPr>
-          <w:rFonts w:ascii="Times New Roman" w:hAnsi="Times New Roman" w:cs="Times New Roman"/>
-          <w:sz w:val="28"/>
-          <w:szCs w:val="28"/>
-          <w:lang w:val="ru-BY"/>
-        </w:rPr>
-        <w:t xml:space="preserve"> – </w:t>
-      </w:r>
-      <w:r>
-        <w:rPr>
-          <w:rFonts w:ascii="Times New Roman" w:hAnsi="Times New Roman" w:cs="Times New Roman"/>
-          <w:sz w:val="28"/>
-          <w:szCs w:val="28"/>
-          <w:lang w:val="ru-BY"/>
-        </w:rPr>
-        <w:t>Коммит файла</w:t>
-      </w:r>
-      <w:r>
-        <w:rPr>
-          <w:rFonts w:ascii="Times New Roman" w:hAnsi="Times New Roman" w:cs="Times New Roman"/>
-          <w:sz w:val="28"/>
-          <w:szCs w:val="28"/>
-          <w:lang w:val="ru-RU"/>
-        </w:rPr>
-        <w:t xml:space="preserve"> </w:t>
-      </w:r>
-      <w:r>
-        <w:rPr>
-          <w:rFonts w:ascii="Times New Roman" w:hAnsi="Times New Roman" w:cs="Times New Roman"/>
-          <w:sz w:val="28"/>
-          <w:szCs w:val="28"/>
           <w:lang w:val="ru-BY"/>
         </w:rPr>
         <w:br/>
@@ -818,9 +759,9 @@
       <w:r>
         <w:rPr>
           <w:rFonts w:ascii="Times New Roman" w:hAnsi="Times New Roman" w:cs="Times New Roman"/>
-          <w:sz w:val="28"/>
-          <w:szCs w:val="28"/>
-          <w:lang w:val="ru-BY"/>
+          <w:noProof/>
+          <w:sz w:val="28"/>
+          <w:szCs w:val="28"/>
         </w:rPr>
         <w:drawing>
           <wp:inline distT="0" distB="0" distL="0" distR="0" wp14:anchorId="2739E156" wp14:editId="2CBB6E28">
@@ -874,14 +815,51 @@
           <w:szCs w:val="28"/>
           <w:lang w:val="ru-BY"/>
         </w:rPr>
-        <w:t>Рисунок</w:t>
-      </w:r>
-      <w:r>
-        <w:rPr>
-          <w:rFonts w:ascii="Times New Roman" w:hAnsi="Times New Roman" w:cs="Times New Roman"/>
-          <w:sz w:val="28"/>
-          <w:szCs w:val="28"/>
-          <w:lang w:val="ru-BY"/>
+        <w:t xml:space="preserve">Рисунок </w:t>
+      </w:r>
+      <w:r>
+        <w:rPr>
+          <w:rFonts w:ascii="Times New Roman" w:hAnsi="Times New Roman" w:cs="Times New Roman"/>
+          <w:sz w:val="28"/>
+          <w:szCs w:val="28"/>
+          <w:lang w:val="ru-RU"/>
+        </w:rPr>
+        <w:t>6</w:t>
+      </w:r>
+      <w:r>
+        <w:rPr>
+          <w:rFonts w:ascii="Times New Roman" w:hAnsi="Times New Roman" w:cs="Times New Roman"/>
+          <w:sz w:val="28"/>
+          <w:szCs w:val="28"/>
+          <w:lang w:val="ru-BY"/>
+        </w:rPr>
+        <w:t xml:space="preserve"> – </w:t>
+      </w:r>
+      <w:r>
+        <w:rPr>
+          <w:rFonts w:ascii="Times New Roman" w:hAnsi="Times New Roman" w:cs="Times New Roman"/>
+          <w:sz w:val="28"/>
+          <w:szCs w:val="28"/>
+          <w:lang w:val="ru-BY"/>
+        </w:rPr>
+        <w:t xml:space="preserve">Отправика файла на </w:t>
+      </w:r>
+      <w:proofErr w:type="spellStart"/>
+      <w:r>
+        <w:rPr>
+          <w:rFonts w:ascii="Times New Roman" w:hAnsi="Times New Roman" w:cs="Times New Roman"/>
+          <w:sz w:val="28"/>
+          <w:szCs w:val="28"/>
+        </w:rPr>
+        <w:t>Git</w:t>
+      </w:r>
+      <w:proofErr w:type="spellEnd"/>
+      <w:r>
+        <w:rPr>
+          <w:rFonts w:ascii="Times New Roman" w:hAnsi="Times New Roman" w:cs="Times New Roman"/>
+          <w:sz w:val="28"/>
+          <w:szCs w:val="28"/>
+          <w:lang w:val="ru-RU"/>
         </w:rPr>
         <w:t xml:space="preserve"> </w:t>
       </w:r>
@@ -890,52 +868,6 @@
           <w:rFonts w:ascii="Times New Roman" w:hAnsi="Times New Roman" w:cs="Times New Roman"/>
           <w:sz w:val="28"/>
           <w:szCs w:val="28"/>
-          <w:lang w:val="ru-RU"/>
-        </w:rPr>
-        <w:t>6</w:t>
-      </w:r>
-      <w:r>
-        <w:rPr>
-          <w:rFonts w:ascii="Times New Roman" w:hAnsi="Times New Roman" w:cs="Times New Roman"/>
-          <w:sz w:val="28"/>
-          <w:szCs w:val="28"/>
-          <w:lang w:val="ru-BY"/>
-        </w:rPr>
-        <w:t xml:space="preserve"> – </w:t>
-      </w:r>
-      <w:r>
-        <w:rPr>
-          <w:rFonts w:ascii="Times New Roman" w:hAnsi="Times New Roman" w:cs="Times New Roman"/>
-          <w:sz w:val="28"/>
-          <w:szCs w:val="28"/>
-          <w:lang w:val="ru-BY"/>
-        </w:rPr>
-        <w:t xml:space="preserve">Отправика файла на </w:t>
-      </w:r>
-      <w:proofErr w:type="spellStart"/>
-      <w:r>
-        <w:rPr>
-          <w:rFonts w:ascii="Times New Roman" w:hAnsi="Times New Roman" w:cs="Times New Roman"/>
-          <w:sz w:val="28"/>
-          <w:szCs w:val="28"/>
-        </w:rPr>
-        <w:t>Git</w:t>
-      </w:r>
-      <w:proofErr w:type="spellEnd"/>
-      <w:r>
-        <w:rPr>
-          <w:rFonts w:ascii="Times New Roman" w:hAnsi="Times New Roman" w:cs="Times New Roman"/>
-          <w:sz w:val="28"/>
-          <w:szCs w:val="28"/>
-          <w:lang w:val="ru-RU"/>
-        </w:rPr>
-        <w:t xml:space="preserve"> </w:t>
-      </w:r>
-      <w:r>
-        <w:rPr>
-          <w:rFonts w:ascii="Times New Roman" w:hAnsi="Times New Roman" w:cs="Times New Roman"/>
-          <w:sz w:val="28"/>
-          <w:szCs w:val="28"/>
         </w:rPr>
         <w:t>Hub</w:t>
       </w:r>
@@ -966,9 +898,9 @@
       <w:r>
         <w:rPr>
           <w:rFonts w:ascii="Times New Roman" w:hAnsi="Times New Roman" w:cs="Times New Roman"/>
-          <w:sz w:val="28"/>
-          <w:szCs w:val="28"/>
-          <w:lang w:val="ru-RU"/>
+          <w:noProof/>
+          <w:sz w:val="28"/>
+          <w:szCs w:val="28"/>
         </w:rPr>
         <w:drawing>
           <wp:inline distT="0" distB="0" distL="0" distR="0" wp14:anchorId="13160392" wp14:editId="08E47120">
@@ -1025,7 +957,25 @@
           <w:szCs w:val="28"/>
           <w:lang w:val="ru-BY"/>
         </w:rPr>
-        <w:t>Рисунок</w:t>
+        <w:t xml:space="preserve">Рисунок </w:t>
+      </w:r>
+      <w:r>
+        <w:rPr>
+          <w:rFonts w:ascii="Times New Roman" w:hAnsi="Times New Roman" w:cs="Times New Roman"/>
+          <w:sz w:val="28"/>
+          <w:szCs w:val="28"/>
+          <w:lang w:val="ru-RU"/>
+        </w:rPr>
+        <w:t>7</w:t>
+      </w:r>
+      <w:r>
+        <w:rPr>
+          <w:rFonts w:ascii="Times New Roman" w:hAnsi="Times New Roman" w:cs="Times New Roman"/>
+          <w:sz w:val="28"/>
+          <w:szCs w:val="28"/>
+          <w:lang w:val="ru-BY"/>
+        </w:rPr>
+        <w:t xml:space="preserve"> – Коммит через</w:t>
       </w:r>
       <w:r>
         <w:rPr>
@@ -1036,61 +986,25 @@
         </w:rPr>
         <w:t xml:space="preserve"> </w:t>
       </w:r>
-      <w:r>
-        <w:rPr>
-          <w:rFonts w:ascii="Times New Roman" w:hAnsi="Times New Roman" w:cs="Times New Roman"/>
-          <w:sz w:val="28"/>
-          <w:szCs w:val="28"/>
-          <w:lang w:val="ru-RU"/>
-        </w:rPr>
-        <w:t>7</w:t>
-      </w:r>
-      <w:r>
-        <w:rPr>
-          <w:rFonts w:ascii="Times New Roman" w:hAnsi="Times New Roman" w:cs="Times New Roman"/>
-          <w:sz w:val="28"/>
-          <w:szCs w:val="28"/>
-          <w:lang w:val="ru-BY"/>
-        </w:rPr>
-        <w:t xml:space="preserve"> – </w:t>
-      </w:r>
-      <w:r>
-        <w:rPr>
-          <w:rFonts w:ascii="Times New Roman" w:hAnsi="Times New Roman" w:cs="Times New Roman"/>
-          <w:sz w:val="28"/>
-          <w:szCs w:val="28"/>
-          <w:lang w:val="ru-BY"/>
-        </w:rPr>
-        <w:t>Коммит через</w:t>
-      </w:r>
-      <w:r>
-        <w:rPr>
-          <w:rFonts w:ascii="Times New Roman" w:hAnsi="Times New Roman" w:cs="Times New Roman"/>
-          <w:sz w:val="28"/>
-          <w:szCs w:val="28"/>
-          <w:lang w:val="ru-BY"/>
+      <w:proofErr w:type="spellStart"/>
+      <w:r>
+        <w:rPr>
+          <w:rFonts w:ascii="Times New Roman" w:hAnsi="Times New Roman" w:cs="Times New Roman"/>
+          <w:sz w:val="28"/>
+          <w:szCs w:val="28"/>
+        </w:rPr>
+        <w:t>Git</w:t>
+      </w:r>
+      <w:proofErr w:type="spellEnd"/>
+      <w:r>
+        <w:rPr>
+          <w:rFonts w:ascii="Times New Roman" w:hAnsi="Times New Roman" w:cs="Times New Roman"/>
+          <w:sz w:val="28"/>
+          <w:szCs w:val="28"/>
+          <w:lang w:val="ru-RU"/>
         </w:rPr>
         <w:t xml:space="preserve"> </w:t>
       </w:r>
-      <w:proofErr w:type="spellStart"/>
-      <w:r>
-        <w:rPr>
-          <w:rFonts w:ascii="Times New Roman" w:hAnsi="Times New Roman" w:cs="Times New Roman"/>
-          <w:sz w:val="28"/>
-          <w:szCs w:val="28"/>
-        </w:rPr>
-        <w:t>Git</w:t>
-      </w:r>
-      <w:proofErr w:type="spellEnd"/>
-      <w:r>
-        <w:rPr>
-          <w:rFonts w:ascii="Times New Roman" w:hAnsi="Times New Roman" w:cs="Times New Roman"/>
-          <w:sz w:val="28"/>
-          <w:szCs w:val="28"/>
-          <w:lang w:val="ru-RU"/>
-        </w:rPr>
-        <w:t xml:space="preserve"> </w:t>
-      </w:r>
       <w:r>
         <w:rPr>
           <w:rFonts w:ascii="Times New Roman" w:hAnsi="Times New Roman" w:cs="Times New Roman"/>
@@ -1120,6 +1034,7 @@
       <w:r>
         <w:rPr>
           <w:rFonts w:ascii="Times New Roman" w:hAnsi="Times New Roman" w:cs="Times New Roman"/>
+          <w:noProof/>
           <w:sz w:val="28"/>
           <w:szCs w:val="28"/>
         </w:rPr>
@@ -1176,14 +1091,51 @@
           <w:szCs w:val="28"/>
           <w:lang w:val="ru-BY"/>
         </w:rPr>
-        <w:t>Рисунок</w:t>
-      </w:r>
-      <w:r>
-        <w:rPr>
-          <w:rFonts w:ascii="Times New Roman" w:hAnsi="Times New Roman" w:cs="Times New Roman"/>
-          <w:sz w:val="28"/>
-          <w:szCs w:val="28"/>
-          <w:lang w:val="ru-BY"/>
+        <w:t xml:space="preserve">Рисунок </w:t>
+      </w:r>
+      <w:r>
+        <w:rPr>
+          <w:rFonts w:ascii="Times New Roman" w:hAnsi="Times New Roman" w:cs="Times New Roman"/>
+          <w:sz w:val="28"/>
+          <w:szCs w:val="28"/>
+          <w:lang w:val="ru-RU"/>
+        </w:rPr>
+        <w:t>8</w:t>
+      </w:r>
+      <w:r>
+        <w:rPr>
+          <w:rFonts w:ascii="Times New Roman" w:hAnsi="Times New Roman" w:cs="Times New Roman"/>
+          <w:sz w:val="28"/>
+          <w:szCs w:val="28"/>
+          <w:lang w:val="ru-BY"/>
+        </w:rPr>
+        <w:t xml:space="preserve"> – </w:t>
+      </w:r>
+      <w:r>
+        <w:rPr>
+          <w:rFonts w:ascii="Times New Roman" w:hAnsi="Times New Roman" w:cs="Times New Roman"/>
+          <w:sz w:val="28"/>
+          <w:szCs w:val="28"/>
+          <w:lang w:val="ru-BY"/>
+        </w:rPr>
+        <w:t xml:space="preserve">Стянули с </w:t>
+      </w:r>
+      <w:proofErr w:type="spellStart"/>
+      <w:r>
+        <w:rPr>
+          <w:rFonts w:ascii="Times New Roman" w:hAnsi="Times New Roman" w:cs="Times New Roman"/>
+          <w:sz w:val="28"/>
+          <w:szCs w:val="28"/>
+        </w:rPr>
+        <w:t>Git</w:t>
+      </w:r>
+      <w:proofErr w:type="spellEnd"/>
+      <w:r>
+        <w:rPr>
+          <w:rFonts w:ascii="Times New Roman" w:hAnsi="Times New Roman" w:cs="Times New Roman"/>
+          <w:sz w:val="28"/>
+          <w:szCs w:val="28"/>
+          <w:lang w:val="ru-RU"/>
         </w:rPr>
         <w:t xml:space="preserve"> </w:t>
       </w:r>
@@ -1192,38 +1144,9 @@
           <w:rFonts w:ascii="Times New Roman" w:hAnsi="Times New Roman" w:cs="Times New Roman"/>
           <w:sz w:val="28"/>
           <w:szCs w:val="28"/>
-          <w:lang w:val="ru-RU"/>
-        </w:rPr>
-        <w:t>8</w:t>
-      </w:r>
-      <w:r>
-        <w:rPr>
-          <w:rFonts w:ascii="Times New Roman" w:hAnsi="Times New Roman" w:cs="Times New Roman"/>
-          <w:sz w:val="28"/>
-          <w:szCs w:val="28"/>
-          <w:lang w:val="ru-BY"/>
-        </w:rPr>
-        <w:t xml:space="preserve"> – </w:t>
-      </w:r>
-      <w:r>
-        <w:rPr>
-          <w:rFonts w:ascii="Times New Roman" w:hAnsi="Times New Roman" w:cs="Times New Roman"/>
-          <w:sz w:val="28"/>
-          <w:szCs w:val="28"/>
-          <w:lang w:val="ru-BY"/>
-        </w:rPr>
-        <w:t xml:space="preserve">Стянули с </w:t>
-      </w:r>
-      <w:proofErr w:type="spellStart"/>
-      <w:r>
-        <w:rPr>
-          <w:rFonts w:ascii="Times New Roman" w:hAnsi="Times New Roman" w:cs="Times New Roman"/>
-          <w:sz w:val="28"/>
-          <w:szCs w:val="28"/>
-        </w:rPr>
-        <w:t>Git</w:t>
-      </w:r>
-      <w:proofErr w:type="spellEnd"/>
+        </w:rPr>
+        <w:t>Hub</w:t>
+      </w:r>
       <w:r>
         <w:rPr>
           <w:rFonts w:ascii="Times New Roman" w:hAnsi="Times New Roman" w:cs="Times New Roman"/>
@@ -1238,23 +1161,6 @@
           <w:rFonts w:ascii="Times New Roman" w:hAnsi="Times New Roman" w:cs="Times New Roman"/>
           <w:sz w:val="28"/>
           <w:szCs w:val="28"/>
-        </w:rPr>
-        <w:t>Hub</w:t>
-      </w:r>
-      <w:r>
-        <w:rPr>
-          <w:rFonts w:ascii="Times New Roman" w:hAnsi="Times New Roman" w:cs="Times New Roman"/>
-          <w:sz w:val="28"/>
-          <w:szCs w:val="28"/>
-          <w:lang w:val="ru-RU"/>
-        </w:rPr>
-        <w:t xml:space="preserve"> </w:t>
-      </w:r>
-      <w:r>
-        <w:rPr>
-          <w:rFonts w:ascii="Times New Roman" w:hAnsi="Times New Roman" w:cs="Times New Roman"/>
-          <w:sz w:val="28"/>
-          <w:szCs w:val="28"/>
           <w:lang w:val="ru-BY"/>
         </w:rPr>
         <w:t>обновленный файл</w:t>
@@ -1286,9 +1192,9 @@
       <w:r>
         <w:rPr>
           <w:rFonts w:ascii="Times New Roman" w:hAnsi="Times New Roman" w:cs="Times New Roman"/>
-          <w:sz w:val="28"/>
-          <w:szCs w:val="28"/>
-          <w:lang w:val="ru-BY"/>
+          <w:noProof/>
+          <w:sz w:val="28"/>
+          <w:szCs w:val="28"/>
         </w:rPr>
         <w:lastRenderedPageBreak/>
         <w:drawing>
@@ -1343,14 +1249,41 @@
           <w:szCs w:val="28"/>
           <w:lang w:val="ru-BY"/>
         </w:rPr>
-        <w:t>Рисунок</w:t>
-      </w:r>
-      <w:r>
-        <w:rPr>
-          <w:rFonts w:ascii="Times New Roman" w:hAnsi="Times New Roman" w:cs="Times New Roman"/>
-          <w:sz w:val="28"/>
-          <w:szCs w:val="28"/>
-          <w:lang w:val="ru-BY"/>
+        <w:t xml:space="preserve">Рисунок </w:t>
+      </w:r>
+      <w:r>
+        <w:rPr>
+          <w:rFonts w:ascii="Times New Roman" w:hAnsi="Times New Roman" w:cs="Times New Roman"/>
+          <w:sz w:val="28"/>
+          <w:szCs w:val="28"/>
+          <w:lang w:val="ru-RU"/>
+        </w:rPr>
+        <w:t>9</w:t>
+      </w:r>
+      <w:r>
+        <w:rPr>
+          <w:rFonts w:ascii="Times New Roman" w:hAnsi="Times New Roman" w:cs="Times New Roman"/>
+          <w:sz w:val="28"/>
+          <w:szCs w:val="28"/>
+          <w:lang w:val="ru-BY"/>
+        </w:rPr>
+        <w:t xml:space="preserve"> – </w:t>
+      </w:r>
+      <w:r>
+        <w:rPr>
+          <w:rFonts w:ascii="Times New Roman" w:hAnsi="Times New Roman" w:cs="Times New Roman"/>
+          <w:sz w:val="28"/>
+          <w:szCs w:val="28"/>
+          <w:lang w:val="ru-BY"/>
+        </w:rPr>
+        <w:t>Обновленный файл</w:t>
+      </w:r>
+      <w:r>
+        <w:rPr>
+          <w:rFonts w:ascii="Times New Roman" w:hAnsi="Times New Roman" w:cs="Times New Roman"/>
+          <w:sz w:val="28"/>
+          <w:szCs w:val="28"/>
+          <w:lang w:val="ru-RU"/>
         </w:rPr>
         <w:t xml:space="preserve"> </w:t>
       </w:r>
@@ -1359,27 +1292,8 @@
           <w:rFonts w:ascii="Times New Roman" w:hAnsi="Times New Roman" w:cs="Times New Roman"/>
           <w:sz w:val="28"/>
           <w:szCs w:val="28"/>
-          <w:lang w:val="ru-RU"/>
-        </w:rPr>
-        <w:t>9</w:t>
-      </w:r>
-      <w:r>
-        <w:rPr>
-          <w:rFonts w:ascii="Times New Roman" w:hAnsi="Times New Roman" w:cs="Times New Roman"/>
-          <w:sz w:val="28"/>
-          <w:szCs w:val="28"/>
-          <w:lang w:val="ru-BY"/>
-        </w:rPr>
-        <w:t xml:space="preserve"> – </w:t>
-      </w:r>
-      <w:r>
-        <w:rPr>
-          <w:rFonts w:ascii="Times New Roman" w:hAnsi="Times New Roman" w:cs="Times New Roman"/>
-          <w:sz w:val="28"/>
-          <w:szCs w:val="28"/>
-          <w:lang w:val="ru-BY"/>
-        </w:rPr>
-        <w:t>Обновленный файл</w:t>
+        </w:rPr>
+        <w:t>c</w:t>
       </w:r>
       <w:r>
         <w:rPr>
@@ -1395,23 +1309,6 @@
           <w:rFonts w:ascii="Times New Roman" w:hAnsi="Times New Roman" w:cs="Times New Roman"/>
           <w:sz w:val="28"/>
           <w:szCs w:val="28"/>
-        </w:rPr>
-        <w:t>c</w:t>
-      </w:r>
-      <w:r>
-        <w:rPr>
-          <w:rFonts w:ascii="Times New Roman" w:hAnsi="Times New Roman" w:cs="Times New Roman"/>
-          <w:sz w:val="28"/>
-          <w:szCs w:val="28"/>
-          <w:lang w:val="ru-RU"/>
-        </w:rPr>
-        <w:t xml:space="preserve"> </w:t>
-      </w:r>
-      <w:r>
-        <w:rPr>
-          <w:rFonts w:ascii="Times New Roman" w:hAnsi="Times New Roman" w:cs="Times New Roman"/>
-          <w:sz w:val="28"/>
-          <w:szCs w:val="28"/>
           <w:lang w:val="ru-BY"/>
         </w:rPr>
         <w:t>добавлением текста</w:t>
@@ -1442,6 +1339,7 @@
       <w:r>
         <w:rPr>
           <w:rFonts w:ascii="Times New Roman" w:hAnsi="Times New Roman" w:cs="Times New Roman"/>
+          <w:noProof/>
           <w:sz w:val="28"/>
           <w:szCs w:val="28"/>
         </w:rPr>
@@ -1501,34 +1399,7 @@
           <w:szCs w:val="28"/>
           <w:lang w:val="ru-BY"/>
         </w:rPr>
-        <w:t>Рисунок 1</w:t>
-      </w:r>
-      <w:r>
-        <w:rPr>
-          <w:rFonts w:ascii="Times New Roman" w:hAnsi="Times New Roman" w:cs="Times New Roman"/>
-          <w:sz w:val="28"/>
-          <w:szCs w:val="28"/>
-          <w:lang w:val="ru-BY"/>
-        </w:rPr>
-        <w:t>0</w:t>
-      </w:r>
-      <w:r>
-        <w:rPr>
-          <w:rFonts w:ascii="Times New Roman" w:hAnsi="Times New Roman" w:cs="Times New Roman"/>
-          <w:sz w:val="28"/>
-          <w:szCs w:val="28"/>
-          <w:lang w:val="ru-BY"/>
-        </w:rPr>
-        <w:t xml:space="preserve"> – </w:t>
-      </w:r>
-      <w:r>
-        <w:rPr>
-          <w:rFonts w:ascii="Times New Roman" w:hAnsi="Times New Roman" w:cs="Times New Roman"/>
-          <w:sz w:val="28"/>
-          <w:szCs w:val="28"/>
-          <w:lang w:val="ru-BY"/>
-        </w:rPr>
-        <w:t>Создание и переход</w:t>
+        <w:t>Рисунок 10 – Создание и переход</w:t>
       </w:r>
       <w:r>
         <w:rPr>
@@ -1574,13 +1445,12 @@
         </w:rPr>
         <w:br/>
       </w:r>
-      <w:bookmarkStart w:id="0" w:name="_GoBack"/>
-      <w:r>
-        <w:rPr>
-          <w:rFonts w:ascii="Times New Roman" w:hAnsi="Times New Roman" w:cs="Times New Roman"/>
-          <w:sz w:val="28"/>
-          <w:szCs w:val="28"/>
-          <w:lang w:val="ru-RU"/>
+      <w:r>
+        <w:rPr>
+          <w:rFonts w:ascii="Times New Roman" w:hAnsi="Times New Roman" w:cs="Times New Roman"/>
+          <w:noProof/>
+          <w:sz w:val="28"/>
+          <w:szCs w:val="28"/>
         </w:rPr>
         <w:drawing>
           <wp:inline distT="0" distB="0" distL="0" distR="0" wp14:anchorId="25722BA6" wp14:editId="7FFD5C61">
@@ -1618,7 +1488,6 @@
           </wp:inline>
         </w:drawing>
       </w:r>
-      <w:bookmarkEnd w:id="0"/>
       <w:r>
         <w:rPr>
           <w:rFonts w:ascii="Times New Roman" w:hAnsi="Times New Roman" w:cs="Times New Roman"/>
@@ -1635,34 +1504,7 @@
           <w:szCs w:val="28"/>
           <w:lang w:val="ru-BY"/>
         </w:rPr>
-        <w:t>Рисунок 1</w:t>
-      </w:r>
-      <w:r>
-        <w:rPr>
-          <w:rFonts w:ascii="Times New Roman" w:hAnsi="Times New Roman" w:cs="Times New Roman"/>
-          <w:sz w:val="28"/>
-          <w:szCs w:val="28"/>
-          <w:lang w:val="ru-BY"/>
-        </w:rPr>
-        <w:t>1</w:t>
-      </w:r>
-      <w:r>
-        <w:rPr>
-          <w:rFonts w:ascii="Times New Roman" w:hAnsi="Times New Roman" w:cs="Times New Roman"/>
-          <w:sz w:val="28"/>
-          <w:szCs w:val="28"/>
-          <w:lang w:val="ru-BY"/>
-        </w:rPr>
-        <w:t xml:space="preserve"> – </w:t>
-      </w:r>
-      <w:r>
-        <w:rPr>
-          <w:rFonts w:ascii="Times New Roman" w:hAnsi="Times New Roman" w:cs="Times New Roman"/>
-          <w:sz w:val="28"/>
-          <w:szCs w:val="28"/>
-          <w:lang w:val="ru-BY"/>
-        </w:rPr>
-        <w:t>Сохранение и коммит</w:t>
+        <w:t>Рисунок 11 – Сохранение и коммит</w:t>
       </w:r>
       <w:r>
         <w:rPr>
@@ -1735,6 +1577,7 @@
       <w:r>
         <w:rPr>
           <w:rFonts w:ascii="Times New Roman" w:hAnsi="Times New Roman" w:cs="Times New Roman"/>
+          <w:noProof/>
           <w:sz w:val="28"/>
           <w:szCs w:val="28"/>
         </w:rPr>
@@ -1793,34 +1636,7 @@
           <w:szCs w:val="28"/>
           <w:lang w:val="ru-BY"/>
         </w:rPr>
-        <w:t>Рисунок 1</w:t>
-      </w:r>
-      <w:r>
-        <w:rPr>
-          <w:rFonts w:ascii="Times New Roman" w:hAnsi="Times New Roman" w:cs="Times New Roman"/>
-          <w:sz w:val="28"/>
-          <w:szCs w:val="28"/>
-          <w:lang w:val="ru-BY"/>
-        </w:rPr>
-        <w:t>2</w:t>
-      </w:r>
-      <w:r>
-        <w:rPr>
-          <w:rFonts w:ascii="Times New Roman" w:hAnsi="Times New Roman" w:cs="Times New Roman"/>
-          <w:sz w:val="28"/>
-          <w:szCs w:val="28"/>
-          <w:lang w:val="ru-BY"/>
-        </w:rPr>
-        <w:t xml:space="preserve"> – </w:t>
-      </w:r>
-      <w:r>
-        <w:rPr>
-          <w:rFonts w:ascii="Times New Roman" w:hAnsi="Times New Roman" w:cs="Times New Roman"/>
-          <w:sz w:val="28"/>
-          <w:szCs w:val="28"/>
-          <w:lang w:val="ru-BY"/>
-        </w:rPr>
-        <w:t>Добавление строки</w:t>
+        <w:t>Рисунок 12 – Добавление строки</w:t>
       </w:r>
       <w:r>
         <w:rPr>
@@ -1895,6 +1711,7 @@
       <w:r>
         <w:rPr>
           <w:rFonts w:ascii="Times New Roman" w:hAnsi="Times New Roman" w:cs="Times New Roman"/>
+          <w:noProof/>
           <w:sz w:val="28"/>
           <w:szCs w:val="28"/>
         </w:rPr>
@@ -1951,25 +1768,7 @@
           <w:szCs w:val="28"/>
           <w:lang w:val="ru-BY"/>
         </w:rPr>
-        <w:t>Рисунок 1</w:t>
-      </w:r>
-      <w:r>
-        <w:rPr>
-          <w:rFonts w:ascii="Times New Roman" w:hAnsi="Times New Roman" w:cs="Times New Roman"/>
-          <w:sz w:val="28"/>
-          <w:szCs w:val="28"/>
-          <w:lang w:val="ru-BY"/>
-        </w:rPr>
-        <w:t>3</w:t>
-      </w:r>
-      <w:r>
-        <w:rPr>
-          <w:rFonts w:ascii="Times New Roman" w:hAnsi="Times New Roman" w:cs="Times New Roman"/>
-          <w:sz w:val="28"/>
-          <w:szCs w:val="28"/>
-          <w:lang w:val="ru-BY"/>
-        </w:rPr>
-        <w:t xml:space="preserve"> – </w:t>
+        <w:t xml:space="preserve">Рисунок 13 – </w:t>
       </w:r>
       <w:r>
         <w:rPr>
@@ -2050,9 +1849,9 @@
       <w:r>
         <w:rPr>
           <w:rFonts w:ascii="Times New Roman" w:hAnsi="Times New Roman" w:cs="Times New Roman"/>
-          <w:sz w:val="28"/>
-          <w:szCs w:val="28"/>
-          <w:lang w:val="ru-RU"/>
+          <w:noProof/>
+          <w:sz w:val="28"/>
+          <w:szCs w:val="28"/>
         </w:rPr>
         <w:drawing>
           <wp:inline distT="0" distB="0" distL="0" distR="0" wp14:anchorId="4E3085F5" wp14:editId="4C3C0615">
@@ -2109,34 +1908,7 @@
           <w:szCs w:val="28"/>
           <w:lang w:val="ru-BY"/>
         </w:rPr>
-        <w:t>Рисунок 1</w:t>
-      </w:r>
-      <w:r>
-        <w:rPr>
-          <w:rFonts w:ascii="Times New Roman" w:hAnsi="Times New Roman" w:cs="Times New Roman"/>
-          <w:sz w:val="28"/>
-          <w:szCs w:val="28"/>
-          <w:lang w:val="ru-BY"/>
-        </w:rPr>
-        <w:t>4</w:t>
-      </w:r>
-      <w:r>
-        <w:rPr>
-          <w:rFonts w:ascii="Times New Roman" w:hAnsi="Times New Roman" w:cs="Times New Roman"/>
-          <w:sz w:val="28"/>
-          <w:szCs w:val="28"/>
-          <w:lang w:val="ru-BY"/>
-        </w:rPr>
-        <w:t xml:space="preserve"> – </w:t>
-      </w:r>
-      <w:r>
-        <w:rPr>
-          <w:rFonts w:ascii="Times New Roman" w:hAnsi="Times New Roman" w:cs="Times New Roman"/>
-          <w:sz w:val="28"/>
-          <w:szCs w:val="28"/>
-          <w:lang w:val="ru-BY"/>
-        </w:rPr>
-        <w:t>Добавление</w:t>
+        <w:t>Рисунок 14 – Добавление</w:t>
       </w:r>
       <w:r>
         <w:rPr>
@@ -2229,9 +2001,9 @@
       <w:r>
         <w:rPr>
           <w:rFonts w:ascii="Times New Roman" w:hAnsi="Times New Roman" w:cs="Times New Roman"/>
-          <w:sz w:val="28"/>
-          <w:szCs w:val="28"/>
-          <w:lang w:val="ru-RU"/>
+          <w:noProof/>
+          <w:sz w:val="28"/>
+          <w:szCs w:val="28"/>
         </w:rPr>
         <w:drawing>
           <wp:inline distT="0" distB="0" distL="0" distR="0" wp14:anchorId="3933C4CB" wp14:editId="42ABEA16">
@@ -2288,34 +2060,7 @@
           <w:szCs w:val="28"/>
           <w:lang w:val="ru-BY"/>
         </w:rPr>
-        <w:t>Рисунок 1</w:t>
-      </w:r>
-      <w:r>
-        <w:rPr>
-          <w:rFonts w:ascii="Times New Roman" w:hAnsi="Times New Roman" w:cs="Times New Roman"/>
-          <w:sz w:val="28"/>
-          <w:szCs w:val="28"/>
-          <w:lang w:val="ru-BY"/>
-        </w:rPr>
-        <w:t>5</w:t>
-      </w:r>
-      <w:r>
-        <w:rPr>
-          <w:rFonts w:ascii="Times New Roman" w:hAnsi="Times New Roman" w:cs="Times New Roman"/>
-          <w:sz w:val="28"/>
-          <w:szCs w:val="28"/>
-          <w:lang w:val="ru-BY"/>
-        </w:rPr>
-        <w:t xml:space="preserve"> – </w:t>
-      </w:r>
-      <w:r>
-        <w:rPr>
-          <w:rFonts w:ascii="Times New Roman" w:hAnsi="Times New Roman" w:cs="Times New Roman"/>
-          <w:sz w:val="28"/>
-          <w:szCs w:val="28"/>
-          <w:lang w:val="ru-BY"/>
-        </w:rPr>
-        <w:t>Добавление строки</w:t>
+        <w:t>Рисунок 15 – Добавление строки</w:t>
       </w:r>
       <w:r>
         <w:rPr>
@@ -2396,9 +2141,9 @@
       <w:r>
         <w:rPr>
           <w:rFonts w:ascii="Times New Roman" w:hAnsi="Times New Roman" w:cs="Times New Roman"/>
-          <w:sz w:val="28"/>
-          <w:szCs w:val="28"/>
-          <w:lang w:val="ru-RU"/>
+          <w:noProof/>
+          <w:sz w:val="28"/>
+          <w:szCs w:val="28"/>
         </w:rPr>
         <w:drawing>
           <wp:inline distT="0" distB="0" distL="0" distR="0" wp14:anchorId="4FAAD504" wp14:editId="36708DF0">
@@ -2455,25 +2200,7 @@
           <w:szCs w:val="28"/>
           <w:lang w:val="ru-BY"/>
         </w:rPr>
-        <w:t>Рисунок 1</w:t>
-      </w:r>
-      <w:r>
-        <w:rPr>
-          <w:rFonts w:ascii="Times New Roman" w:hAnsi="Times New Roman" w:cs="Times New Roman"/>
-          <w:sz w:val="28"/>
-          <w:szCs w:val="28"/>
-          <w:lang w:val="ru-BY"/>
-        </w:rPr>
-        <w:t>6</w:t>
-      </w:r>
-      <w:r>
-        <w:rPr>
-          <w:rFonts w:ascii="Times New Roman" w:hAnsi="Times New Roman" w:cs="Times New Roman"/>
-          <w:sz w:val="28"/>
-          <w:szCs w:val="28"/>
-          <w:lang w:val="ru-BY"/>
-        </w:rPr>
-        <w:t xml:space="preserve"> – </w:t>
+        <w:t xml:space="preserve">Рисунок 16 – </w:t>
       </w:r>
       <w:r>
         <w:rPr>
@@ -2511,9 +2238,9 @@
       <w:r>
         <w:rPr>
           <w:rFonts w:ascii="Times New Roman" w:hAnsi="Times New Roman" w:cs="Times New Roman"/>
-          <w:sz w:val="28"/>
-          <w:szCs w:val="28"/>
-          <w:lang w:val="ru-BY"/>
+          <w:noProof/>
+          <w:sz w:val="28"/>
+          <w:szCs w:val="28"/>
         </w:rPr>
         <w:lastRenderedPageBreak/>
         <w:drawing>
@@ -2571,34 +2298,7 @@
           <w:szCs w:val="28"/>
           <w:lang w:val="ru-BY"/>
         </w:rPr>
-        <w:t>Рисунок 1</w:t>
-      </w:r>
-      <w:r>
-        <w:rPr>
-          <w:rFonts w:ascii="Times New Roman" w:hAnsi="Times New Roman" w:cs="Times New Roman"/>
-          <w:sz w:val="28"/>
-          <w:szCs w:val="28"/>
-          <w:lang w:val="ru-BY"/>
-        </w:rPr>
-        <w:t>7</w:t>
-      </w:r>
-      <w:r>
-        <w:rPr>
-          <w:rFonts w:ascii="Times New Roman" w:hAnsi="Times New Roman" w:cs="Times New Roman"/>
-          <w:sz w:val="28"/>
-          <w:szCs w:val="28"/>
-          <w:lang w:val="ru-BY"/>
-        </w:rPr>
-        <w:t xml:space="preserve"> – </w:t>
-      </w:r>
-      <w:r>
-        <w:rPr>
-          <w:rFonts w:ascii="Times New Roman" w:hAnsi="Times New Roman" w:cs="Times New Roman"/>
-          <w:sz w:val="28"/>
-          <w:szCs w:val="28"/>
-          <w:lang w:val="ru-BY"/>
-        </w:rPr>
-        <w:t>Просмотр конфликта</w:t>
+        <w:t>Рисунок 17 – Просмотр конфликта</w:t>
       </w:r>
       <w:r>
         <w:rPr>
@@ -2621,9 +2321,9 @@
       <w:r>
         <w:rPr>
           <w:rFonts w:ascii="Times New Roman" w:hAnsi="Times New Roman" w:cs="Times New Roman"/>
-          <w:sz w:val="28"/>
-          <w:szCs w:val="28"/>
-          <w:lang w:val="ru-BY"/>
+          <w:noProof/>
+          <w:sz w:val="28"/>
+          <w:szCs w:val="28"/>
         </w:rPr>
         <w:drawing>
           <wp:inline distT="0" distB="0" distL="0" distR="0" wp14:anchorId="36E4B8CB" wp14:editId="292EABCF">
@@ -2677,65 +2377,38 @@
           <w:szCs w:val="28"/>
           <w:lang w:val="ru-BY"/>
         </w:rPr>
-        <w:t>Рисунок 1</w:t>
-      </w:r>
-      <w:r>
-        <w:rPr>
-          <w:rFonts w:ascii="Times New Roman" w:hAnsi="Times New Roman" w:cs="Times New Roman"/>
-          <w:sz w:val="28"/>
-          <w:szCs w:val="28"/>
-          <w:lang w:val="ru-BY"/>
-        </w:rPr>
-        <w:t>8</w:t>
-      </w:r>
-      <w:r>
-        <w:rPr>
-          <w:rFonts w:ascii="Times New Roman" w:hAnsi="Times New Roman" w:cs="Times New Roman"/>
-          <w:sz w:val="28"/>
-          <w:szCs w:val="28"/>
-          <w:lang w:val="ru-BY"/>
-        </w:rPr>
-        <w:t xml:space="preserve"> – </w:t>
-      </w:r>
-      <w:r>
-        <w:rPr>
-          <w:rFonts w:ascii="Times New Roman" w:hAnsi="Times New Roman" w:cs="Times New Roman"/>
-          <w:sz w:val="28"/>
-          <w:szCs w:val="28"/>
-          <w:lang w:val="ru-BY"/>
-        </w:rPr>
-        <w:t>Исправление конфликта в ручную</w:t>
-      </w:r>
-    </w:p>
-    <w:p>
-      <w:pPr>
-        <w:spacing w:after="0"/>
-        <w:jc w:val="center"/>
-        <w:rPr>
-          <w:rFonts w:ascii="Times New Roman" w:hAnsi="Times New Roman" w:cs="Times New Roman"/>
-          <w:sz w:val="28"/>
-          <w:szCs w:val="28"/>
-          <w:lang w:val="ru-BY"/>
-        </w:rPr>
-      </w:pPr>
-    </w:p>
-    <w:p>
-      <w:pPr>
-        <w:spacing w:after="0"/>
-        <w:jc w:val="center"/>
-        <w:rPr>
-          <w:rFonts w:ascii="Times New Roman" w:hAnsi="Times New Roman" w:cs="Times New Roman"/>
-          <w:sz w:val="28"/>
-          <w:szCs w:val="28"/>
-          <w:lang w:val="ru-BY"/>
-        </w:rPr>
-      </w:pPr>
-      <w:r>
-        <w:rPr>
-          <w:rFonts w:ascii="Times New Roman" w:hAnsi="Times New Roman" w:cs="Times New Roman"/>
-          <w:sz w:val="28"/>
-          <w:szCs w:val="28"/>
-          <w:lang w:val="ru-BY"/>
+        <w:t>Рисунок 18 – Исправление конфликта в ручную</w:t>
+      </w:r>
+    </w:p>
+    <w:p>
+      <w:pPr>
+        <w:spacing w:after="0"/>
+        <w:jc w:val="center"/>
+        <w:rPr>
+          <w:rFonts w:ascii="Times New Roman" w:hAnsi="Times New Roman" w:cs="Times New Roman"/>
+          <w:sz w:val="28"/>
+          <w:szCs w:val="28"/>
+          <w:lang w:val="ru-BY"/>
+        </w:rPr>
+      </w:pPr>
+    </w:p>
+    <w:p>
+      <w:pPr>
+        <w:spacing w:after="0"/>
+        <w:jc w:val="center"/>
+        <w:rPr>
+          <w:rFonts w:ascii="Times New Roman" w:hAnsi="Times New Roman" w:cs="Times New Roman"/>
+          <w:sz w:val="28"/>
+          <w:szCs w:val="28"/>
+          <w:lang w:val="ru-BY"/>
+        </w:rPr>
+      </w:pPr>
+      <w:r>
+        <w:rPr>
+          <w:rFonts w:ascii="Times New Roman" w:hAnsi="Times New Roman" w:cs="Times New Roman"/>
+          <w:noProof/>
+          <w:sz w:val="28"/>
+          <w:szCs w:val="28"/>
         </w:rPr>
         <w:lastRenderedPageBreak/>
         <w:drawing>
@@ -2790,25 +2463,7 @@
           <w:szCs w:val="28"/>
           <w:lang w:val="ru-BY"/>
         </w:rPr>
-        <w:t>Рисунок 1</w:t>
-      </w:r>
-      <w:r>
-        <w:rPr>
-          <w:rFonts w:ascii="Times New Roman" w:hAnsi="Times New Roman" w:cs="Times New Roman"/>
-          <w:sz w:val="28"/>
-          <w:szCs w:val="28"/>
-          <w:lang w:val="ru-BY"/>
-        </w:rPr>
-        <w:t>9</w:t>
-      </w:r>
-      <w:r>
-        <w:rPr>
-          <w:rFonts w:ascii="Times New Roman" w:hAnsi="Times New Roman" w:cs="Times New Roman"/>
-          <w:sz w:val="28"/>
-          <w:szCs w:val="28"/>
-          <w:lang w:val="ru-BY"/>
-        </w:rPr>
-        <w:t xml:space="preserve"> – </w:t>
+        <w:t xml:space="preserve">Рисунок 19 – </w:t>
       </w:r>
       <w:r>
         <w:rPr>
@@ -2846,9 +2501,9 @@
       <w:r>
         <w:rPr>
           <w:rFonts w:ascii="Times New Roman" w:hAnsi="Times New Roman" w:cs="Times New Roman"/>
-          <w:sz w:val="28"/>
-          <w:szCs w:val="28"/>
-          <w:lang w:val="ru-BY"/>
+          <w:noProof/>
+          <w:sz w:val="28"/>
+          <w:szCs w:val="28"/>
         </w:rPr>
         <w:drawing>
           <wp:inline distT="0" distB="0" distL="0" distR="0" wp14:anchorId="5D6613A5" wp14:editId="5ACFB44F">
@@ -2902,16 +2557,102 @@
           <w:szCs w:val="28"/>
           <w:lang w:val="ru-BY"/>
         </w:rPr>
-        <w:t>Рисунок</w:t>
-      </w:r>
-      <w:r>
-        <w:rPr>
-          <w:rFonts w:ascii="Times New Roman" w:hAnsi="Times New Roman" w:cs="Times New Roman"/>
-          <w:sz w:val="28"/>
-          <w:szCs w:val="28"/>
-          <w:lang w:val="ru-BY"/>
-        </w:rPr>
-        <w:t xml:space="preserve"> 20</w:t>
+        <w:t xml:space="preserve">Рисунок 20 – </w:t>
+      </w:r>
+      <w:r>
+        <w:rPr>
+          <w:rFonts w:ascii="Times New Roman" w:hAnsi="Times New Roman" w:cs="Times New Roman"/>
+          <w:sz w:val="28"/>
+          <w:szCs w:val="28"/>
+          <w:lang w:val="ru-BY"/>
+        </w:rPr>
+        <w:t>История ветвления</w:t>
+      </w:r>
+    </w:p>
+    <w:p>
+      <w:pPr>
+        <w:spacing w:after="0"/>
+        <w:jc w:val="center"/>
+        <w:rPr>
+          <w:rFonts w:ascii="Times New Roman" w:hAnsi="Times New Roman" w:cs="Times New Roman"/>
+          <w:sz w:val="28"/>
+          <w:szCs w:val="28"/>
+          <w:lang w:val="ru-BY"/>
+        </w:rPr>
+      </w:pPr>
+      <w:r>
+        <w:rPr>
+          <w:rFonts w:ascii="Times New Roman" w:hAnsi="Times New Roman" w:cs="Times New Roman"/>
+          <w:sz w:val="28"/>
+          <w:szCs w:val="28"/>
+          <w:lang w:val="ru-BY"/>
+        </w:rPr>
+        <w:lastRenderedPageBreak/>
+        <w:drawing>
+          <wp:inline distT="0" distB="0" distL="0" distR="0" wp14:anchorId="4C0D94C9" wp14:editId="638CBBAD">
+            <wp:extent cx="6152515" cy="2716530"/>
+            <wp:effectExtent l="0" t="0" r="635" b="7620"/>
+            <wp:docPr id="21" name="Рисунок 21"/>
+            <wp:cNvGraphicFramePr>
+              <a:graphicFrameLocks xmlns:a="http://schemas.openxmlformats.org/drawingml/2006/main" noChangeAspect="1"/>
+            </wp:cNvGraphicFramePr>
+            <a:graphic xmlns:a="http://schemas.openxmlformats.org/drawingml/2006/main">
+              <a:graphicData uri="http://schemas.openxmlformats.org/drawingml/2006/picture">
+                <pic:pic xmlns:pic="http://schemas.openxmlformats.org/drawingml/2006/picture">
+                  <pic:nvPicPr>
+                    <pic:cNvPr id="1" name=""/>
+                    <pic:cNvPicPr/>
+                  </pic:nvPicPr>
+                  <pic:blipFill>
+                    <a:blip r:embed="rId26"/>
+                    <a:stretch>
+                      <a:fillRect/>
+                    </a:stretch>
+                  </pic:blipFill>
+                  <pic:spPr>
+                    <a:xfrm>
+                      <a:off x="0" y="0"/>
+                      <a:ext cx="6152515" cy="2716530"/>
+                    </a:xfrm>
+                    <a:prstGeom prst="rect">
+                      <a:avLst/>
+                    </a:prstGeom>
+                  </pic:spPr>
+                </pic:pic>
+              </a:graphicData>
+            </a:graphic>
+          </wp:inline>
+        </w:drawing>
+      </w:r>
+    </w:p>
+    <w:p>
+      <w:pPr>
+        <w:spacing w:after="0"/>
+        <w:jc w:val="center"/>
+        <w:rPr>
+          <w:rFonts w:ascii="Times New Roman" w:hAnsi="Times New Roman" w:cs="Times New Roman"/>
+          <w:sz w:val="28"/>
+          <w:szCs w:val="28"/>
+          <w:lang w:val="ru-BY"/>
+        </w:rPr>
+      </w:pPr>
+      <w:r>
+        <w:rPr>
+          <w:rFonts w:ascii="Times New Roman" w:hAnsi="Times New Roman" w:cs="Times New Roman"/>
+          <w:sz w:val="28"/>
+          <w:szCs w:val="28"/>
+          <w:lang w:val="ru-BY"/>
+        </w:rPr>
+        <w:t>Рисунок 2</w:t>
+      </w:r>
+      <w:r>
+        <w:rPr>
+          <w:rFonts w:ascii="Times New Roman" w:hAnsi="Times New Roman" w:cs="Times New Roman"/>
+          <w:sz w:val="28"/>
+          <w:szCs w:val="28"/>
+          <w:lang w:val="ru-BY"/>
+        </w:rPr>
+        <w:t>1</w:t>
       </w:r>
       <w:r>
         <w:rPr>
@@ -2929,11 +2670,42 @@
           <w:szCs w:val="28"/>
           <w:lang w:val="ru-BY"/>
         </w:rPr>
-        <w:t>История ветвления</w:t>
-      </w:r>
+        <w:t xml:space="preserve">Скриншот </w:t>
+      </w:r>
+      <w:r>
+        <w:rPr>
+          <w:rFonts w:ascii="Times New Roman" w:hAnsi="Times New Roman" w:cs="Times New Roman"/>
+          <w:sz w:val="28"/>
+          <w:szCs w:val="28"/>
+        </w:rPr>
+        <w:t>PR</w:t>
+      </w:r>
+      <w:r>
+        <w:rPr>
+          <w:rFonts w:ascii="Times New Roman" w:hAnsi="Times New Roman" w:cs="Times New Roman"/>
+          <w:sz w:val="28"/>
+          <w:szCs w:val="28"/>
+          <w:lang w:val="ru-BY"/>
+        </w:rPr>
+        <w:t>, 8 коммитов</w:t>
+      </w:r>
+      <w:bookmarkStart w:id="0" w:name="_GoBack"/>
+      <w:bookmarkEnd w:id="0"/>
+    </w:p>
+    <w:p>
+      <w:pPr>
+        <w:spacing w:after="0"/>
+        <w:jc w:val="center"/>
+        <w:rPr>
+          <w:rFonts w:ascii="Times New Roman" w:hAnsi="Times New Roman" w:cs="Times New Roman"/>
+          <w:sz w:val="28"/>
+          <w:szCs w:val="28"/>
+          <w:lang w:val="ru-BY"/>
+        </w:rPr>
+      </w:pPr>
     </w:p>
     <w:sectPr>
-      <w:headerReference w:type="default" r:id="rId26"/>
+      <w:headerReference w:type="default" r:id="rId27"/>
       <w:pgSz w:w="12240" w:h="15840"/>
       <w:pgMar w:top="1134" w:right="850" w:bottom="1134" w:left="1701" w:header="708" w:footer="708" w:gutter="0"/>
       <w:cols w:space="708"/>

</xml_diff>